<commit_message>
Improve the template title and fix the findings summary table.
</commit_message>
<xml_diff>
--- a/docs/review-template/review-template.docx
+++ b/docs/review-template/review-template.docx
@@ -6,8 +6,8 @@
       <w:pPr>
         <w:pStyle w:val="Heading2"/>
       </w:pPr>
-      <w:bookmarkStart w:id="0" w:name="review-title"/>
-      <w:bookmarkStart w:id="1" w:name="introduction"/>
+      <w:bookmarkStart w:id="0" w:name="introduction"/>
+      <w:bookmarkStart w:id="1" w:name="review-title"/>
       <w:r>
         <w:t>1. Introduction</w:t>
       </w:r>
@@ -799,7 +799,7 @@
     <w:p>
       <w:r>
         <w:pict w14:anchorId="15DB9D33">
-          <v:rect id="_x0000_i3831" style="width:0;height:1.5pt" o:hralign="center" o:hrstd="t" o:hr="t"/>
+          <v:rect id="_x0000_i1025" style="width:0;height:1.5pt" o:hralign="center" o:hrstd="t" o:hr="t"/>
         </w:pict>
       </w:r>
     </w:p>
@@ -808,7 +808,7 @@
         <w:pStyle w:val="Heading2"/>
       </w:pPr>
       <w:bookmarkStart w:id="8" w:name="review-checklist"/>
-      <w:bookmarkEnd w:id="1"/>
+      <w:bookmarkEnd w:id="0"/>
       <w:bookmarkEnd w:id="7"/>
       <w:r>
         <w:t>2. Review Checklist</w:t>
@@ -3923,7 +3923,7 @@
     <w:p>
       <w:r>
         <w:pict w14:anchorId="252A5A7C">
-          <v:rect id="_x0000_i3832" style="width:0;height:1.5pt" o:hralign="center" o:hrstd="t" o:hr="t"/>
+          <v:rect id="_x0000_i1026" style="width:0;height:1.5pt" o:hralign="center" o:hrstd="t" o:hr="t"/>
         </w:pict>
       </w:r>
     </w:p>
@@ -3961,23 +3961,23 @@
     </w:p>
     <w:tbl>
       <w:tblPr>
-        <w:tblStyle w:val="Table"/>
-        <w:tblW w:w="0" w:type="auto"/>
+        <w:tblStyle w:val="PlainTable1"/>
+        <w:tblW w:w="5000" w:type="pct"/>
         <w:tblLook w:val="0020" w:firstRow="1" w:lastRow="0" w:firstColumn="0" w:lastColumn="0" w:noHBand="0" w:noVBand="0"/>
       </w:tblPr>
       <w:tblGrid>
-        <w:gridCol w:w="1001"/>
-        <w:gridCol w:w="1709"/>
-        <w:gridCol w:w="1844"/>
+        <w:gridCol w:w="2105"/>
+        <w:gridCol w:w="3593"/>
+        <w:gridCol w:w="3878"/>
       </w:tblGrid>
       <w:tr>
         <w:trPr>
           <w:cnfStyle w:val="100000000000" w:firstRow="1" w:lastRow="0" w:firstColumn="0" w:lastColumn="0" w:oddVBand="0" w:evenVBand="0" w:oddHBand="0" w:evenHBand="0" w:firstRowFirstColumn="0" w:firstRowLastColumn="0" w:lastRowFirstColumn="0" w:lastRowLastColumn="0"/>
-          <w:tblHeader/>
         </w:trPr>
         <w:tc>
           <w:tcPr>
-            <w:tcW w:w="0" w:type="auto"/>
+            <w:cnfStyle w:val="000010000000" w:firstRow="0" w:lastRow="0" w:firstColumn="0" w:lastColumn="0" w:oddVBand="1" w:evenVBand="0" w:oddHBand="0" w:evenHBand="0" w:firstRowFirstColumn="0" w:firstRowLastColumn="0" w:lastRowFirstColumn="0" w:lastRowLastColumn="0"/>
+            <w:tcW w:w="1099" w:type="pct"/>
           </w:tcPr>
           <w:p>
             <w:pPr>
@@ -3990,11 +3990,12 @@
         </w:tc>
         <w:tc>
           <w:tcPr>
-            <w:tcW w:w="0" w:type="auto"/>
-          </w:tcPr>
-          <w:p>
-            <w:pPr>
-              <w:pStyle w:val="Compact"/>
+            <w:tcW w:w="1876" w:type="pct"/>
+          </w:tcPr>
+          <w:p>
+            <w:pPr>
+              <w:pStyle w:val="Compact"/>
+              <w:cnfStyle w:val="100000000000" w:firstRow="1" w:lastRow="0" w:firstColumn="0" w:lastColumn="0" w:oddVBand="0" w:evenVBand="0" w:oddHBand="0" w:evenHBand="0" w:firstRowFirstColumn="0" w:firstRowLastColumn="0" w:lastRowFirstColumn="0" w:lastRowLastColumn="0"/>
             </w:pPr>
             <w:r>
               <w:t>Check</w:t>
@@ -4003,7 +4004,8 @@
         </w:tc>
         <w:tc>
           <w:tcPr>
-            <w:tcW w:w="0" w:type="auto"/>
+            <w:cnfStyle w:val="000010000000" w:firstRow="0" w:lastRow="0" w:firstColumn="0" w:lastColumn="0" w:oddVBand="1" w:evenVBand="0" w:oddHBand="0" w:evenHBand="0" w:firstRowFirstColumn="0" w:firstRowLastColumn="0" w:lastRowFirstColumn="0" w:lastRowLastColumn="0"/>
+            <w:tcW w:w="2025" w:type="pct"/>
           </w:tcPr>
           <w:p>
             <w:pPr>
@@ -4016,9 +4018,13 @@
         </w:tc>
       </w:tr>
       <w:tr>
-        <w:tc>
-          <w:tcPr>
-            <w:tcW w:w="0" w:type="auto"/>
+        <w:trPr>
+          <w:cnfStyle w:val="000000100000" w:firstRow="0" w:lastRow="0" w:firstColumn="0" w:lastColumn="0" w:oddVBand="0" w:evenVBand="0" w:oddHBand="1" w:evenHBand="0" w:firstRowFirstColumn="0" w:firstRowLastColumn="0" w:lastRowFirstColumn="0" w:lastRowLastColumn="0"/>
+        </w:trPr>
+        <w:tc>
+          <w:tcPr>
+            <w:cnfStyle w:val="000010000000" w:firstRow="0" w:lastRow="0" w:firstColumn="0" w:lastColumn="0" w:oddVBand="1" w:evenVBand="0" w:oddHBand="0" w:evenHBand="0" w:firstRowFirstColumn="0" w:firstRowLastColumn="0" w:lastRowFirstColumn="0" w:lastRowLastColumn="0"/>
+            <w:tcW w:w="1099" w:type="pct"/>
           </w:tcPr>
           <w:p>
             <w:pPr>
@@ -4035,11 +4041,12 @@
         </w:tc>
         <w:tc>
           <w:tcPr>
-            <w:tcW w:w="0" w:type="auto"/>
-          </w:tcPr>
-          <w:p>
-            <w:pPr>
-              <w:pStyle w:val="Compact"/>
+            <w:tcW w:w="1876" w:type="pct"/>
+          </w:tcPr>
+          <w:p>
+            <w:pPr>
+              <w:pStyle w:val="Compact"/>
+              <w:cnfStyle w:val="000000100000" w:firstRow="0" w:lastRow="0" w:firstColumn="0" w:lastColumn="0" w:oddVBand="0" w:evenVBand="0" w:oddHBand="1" w:evenHBand="0" w:firstRowFirstColumn="0" w:firstRowLastColumn="0" w:lastRowFirstColumn="0" w:lastRowLastColumn="0"/>
             </w:pPr>
             <w:r>
               <w:rPr>
@@ -4052,7 +4059,8 @@
         </w:tc>
         <w:tc>
           <w:tcPr>
-            <w:tcW w:w="0" w:type="auto"/>
+            <w:cnfStyle w:val="000010000000" w:firstRow="0" w:lastRow="0" w:firstColumn="0" w:lastColumn="0" w:oddVBand="1" w:evenVBand="0" w:oddHBand="0" w:evenHBand="0" w:firstRowFirstColumn="0" w:firstRowLastColumn="0" w:lastRowFirstColumn="0" w:lastRowLastColumn="0"/>
+            <w:tcW w:w="2025" w:type="pct"/>
           </w:tcPr>
           <w:p>
             <w:pPr>
@@ -4105,7 +4113,7 @@
         </w:rPr>
         <w:t>State the basis for the overall outcome, including any conditions or follow-up actions required before the review can be considered approved:</w:t>
       </w:r>
-      <w:bookmarkEnd w:id="0"/>
+      <w:bookmarkEnd w:id="1"/>
       <w:bookmarkEnd w:id="17"/>
       <w:bookmarkEnd w:id="19"/>
     </w:p>
@@ -4297,6 +4305,19 @@
     </w:pPr>
     <w:r>
       <w:tab/>
+    </w:r>
+    <w:r>
+      <w:t>[Project Name]</w:t>
+    </w:r>
+  </w:p>
+  <w:p>
+    <w:pPr>
+      <w:pStyle w:val="Header"/>
+    </w:pPr>
+    <w:r>
+      <w:tab/>
+    </w:r>
+    <w:r>
       <w:t>[Review Title]</w:t>
     </w:r>
   </w:p>

</xml_diff>

<commit_message>
Improve the template title and fix the findings summary table. (#6)
Co-authored-by: Malcolm Nixon <Malcolm.Nixon@hiarc.inc>
</commit_message>
<xml_diff>
--- a/docs/review-template/review-template.docx
+++ b/docs/review-template/review-template.docx
@@ -6,8 +6,8 @@
       <w:pPr>
         <w:pStyle w:val="Heading2"/>
       </w:pPr>
-      <w:bookmarkStart w:id="0" w:name="review-title"/>
-      <w:bookmarkStart w:id="1" w:name="introduction"/>
+      <w:bookmarkStart w:id="0" w:name="introduction"/>
+      <w:bookmarkStart w:id="1" w:name="review-title"/>
       <w:r>
         <w:t>1. Introduction</w:t>
       </w:r>
@@ -799,7 +799,7 @@
     <w:p>
       <w:r>
         <w:pict w14:anchorId="15DB9D33">
-          <v:rect id="_x0000_i3831" style="width:0;height:1.5pt" o:hralign="center" o:hrstd="t" o:hr="t"/>
+          <v:rect id="_x0000_i1025" style="width:0;height:1.5pt" o:hralign="center" o:hrstd="t" o:hr="t"/>
         </w:pict>
       </w:r>
     </w:p>
@@ -808,7 +808,7 @@
         <w:pStyle w:val="Heading2"/>
       </w:pPr>
       <w:bookmarkStart w:id="8" w:name="review-checklist"/>
-      <w:bookmarkEnd w:id="1"/>
+      <w:bookmarkEnd w:id="0"/>
       <w:bookmarkEnd w:id="7"/>
       <w:r>
         <w:t>2. Review Checklist</w:t>
@@ -3923,7 +3923,7 @@
     <w:p>
       <w:r>
         <w:pict w14:anchorId="252A5A7C">
-          <v:rect id="_x0000_i3832" style="width:0;height:1.5pt" o:hralign="center" o:hrstd="t" o:hr="t"/>
+          <v:rect id="_x0000_i1026" style="width:0;height:1.5pt" o:hralign="center" o:hrstd="t" o:hr="t"/>
         </w:pict>
       </w:r>
     </w:p>
@@ -3961,23 +3961,23 @@
     </w:p>
     <w:tbl>
       <w:tblPr>
-        <w:tblStyle w:val="Table"/>
-        <w:tblW w:w="0" w:type="auto"/>
+        <w:tblStyle w:val="PlainTable1"/>
+        <w:tblW w:w="5000" w:type="pct"/>
         <w:tblLook w:val="0020" w:firstRow="1" w:lastRow="0" w:firstColumn="0" w:lastColumn="0" w:noHBand="0" w:noVBand="0"/>
       </w:tblPr>
       <w:tblGrid>
-        <w:gridCol w:w="1001"/>
-        <w:gridCol w:w="1709"/>
-        <w:gridCol w:w="1844"/>
+        <w:gridCol w:w="2105"/>
+        <w:gridCol w:w="3593"/>
+        <w:gridCol w:w="3878"/>
       </w:tblGrid>
       <w:tr>
         <w:trPr>
           <w:cnfStyle w:val="100000000000" w:firstRow="1" w:lastRow="0" w:firstColumn="0" w:lastColumn="0" w:oddVBand="0" w:evenVBand="0" w:oddHBand="0" w:evenHBand="0" w:firstRowFirstColumn="0" w:firstRowLastColumn="0" w:lastRowFirstColumn="0" w:lastRowLastColumn="0"/>
-          <w:tblHeader/>
         </w:trPr>
         <w:tc>
           <w:tcPr>
-            <w:tcW w:w="0" w:type="auto"/>
+            <w:cnfStyle w:val="000010000000" w:firstRow="0" w:lastRow="0" w:firstColumn="0" w:lastColumn="0" w:oddVBand="1" w:evenVBand="0" w:oddHBand="0" w:evenHBand="0" w:firstRowFirstColumn="0" w:firstRowLastColumn="0" w:lastRowFirstColumn="0" w:lastRowLastColumn="0"/>
+            <w:tcW w:w="1099" w:type="pct"/>
           </w:tcPr>
           <w:p>
             <w:pPr>
@@ -3990,11 +3990,12 @@
         </w:tc>
         <w:tc>
           <w:tcPr>
-            <w:tcW w:w="0" w:type="auto"/>
-          </w:tcPr>
-          <w:p>
-            <w:pPr>
-              <w:pStyle w:val="Compact"/>
+            <w:tcW w:w="1876" w:type="pct"/>
+          </w:tcPr>
+          <w:p>
+            <w:pPr>
+              <w:pStyle w:val="Compact"/>
+              <w:cnfStyle w:val="100000000000" w:firstRow="1" w:lastRow="0" w:firstColumn="0" w:lastColumn="0" w:oddVBand="0" w:evenVBand="0" w:oddHBand="0" w:evenHBand="0" w:firstRowFirstColumn="0" w:firstRowLastColumn="0" w:lastRowFirstColumn="0" w:lastRowLastColumn="0"/>
             </w:pPr>
             <w:r>
               <w:t>Check</w:t>
@@ -4003,7 +4004,8 @@
         </w:tc>
         <w:tc>
           <w:tcPr>
-            <w:tcW w:w="0" w:type="auto"/>
+            <w:cnfStyle w:val="000010000000" w:firstRow="0" w:lastRow="0" w:firstColumn="0" w:lastColumn="0" w:oddVBand="1" w:evenVBand="0" w:oddHBand="0" w:evenHBand="0" w:firstRowFirstColumn="0" w:firstRowLastColumn="0" w:lastRowFirstColumn="0" w:lastRowLastColumn="0"/>
+            <w:tcW w:w="2025" w:type="pct"/>
           </w:tcPr>
           <w:p>
             <w:pPr>
@@ -4016,9 +4018,13 @@
         </w:tc>
       </w:tr>
       <w:tr>
-        <w:tc>
-          <w:tcPr>
-            <w:tcW w:w="0" w:type="auto"/>
+        <w:trPr>
+          <w:cnfStyle w:val="000000100000" w:firstRow="0" w:lastRow="0" w:firstColumn="0" w:lastColumn="0" w:oddVBand="0" w:evenVBand="0" w:oddHBand="1" w:evenHBand="0" w:firstRowFirstColumn="0" w:firstRowLastColumn="0" w:lastRowFirstColumn="0" w:lastRowLastColumn="0"/>
+        </w:trPr>
+        <w:tc>
+          <w:tcPr>
+            <w:cnfStyle w:val="000010000000" w:firstRow="0" w:lastRow="0" w:firstColumn="0" w:lastColumn="0" w:oddVBand="1" w:evenVBand="0" w:oddHBand="0" w:evenHBand="0" w:firstRowFirstColumn="0" w:firstRowLastColumn="0" w:lastRowFirstColumn="0" w:lastRowLastColumn="0"/>
+            <w:tcW w:w="1099" w:type="pct"/>
           </w:tcPr>
           <w:p>
             <w:pPr>
@@ -4035,11 +4041,12 @@
         </w:tc>
         <w:tc>
           <w:tcPr>
-            <w:tcW w:w="0" w:type="auto"/>
-          </w:tcPr>
-          <w:p>
-            <w:pPr>
-              <w:pStyle w:val="Compact"/>
+            <w:tcW w:w="1876" w:type="pct"/>
+          </w:tcPr>
+          <w:p>
+            <w:pPr>
+              <w:pStyle w:val="Compact"/>
+              <w:cnfStyle w:val="000000100000" w:firstRow="0" w:lastRow="0" w:firstColumn="0" w:lastColumn="0" w:oddVBand="0" w:evenVBand="0" w:oddHBand="1" w:evenHBand="0" w:firstRowFirstColumn="0" w:firstRowLastColumn="0" w:lastRowFirstColumn="0" w:lastRowLastColumn="0"/>
             </w:pPr>
             <w:r>
               <w:rPr>
@@ -4052,7 +4059,8 @@
         </w:tc>
         <w:tc>
           <w:tcPr>
-            <w:tcW w:w="0" w:type="auto"/>
+            <w:cnfStyle w:val="000010000000" w:firstRow="0" w:lastRow="0" w:firstColumn="0" w:lastColumn="0" w:oddVBand="1" w:evenVBand="0" w:oddHBand="0" w:evenHBand="0" w:firstRowFirstColumn="0" w:firstRowLastColumn="0" w:lastRowFirstColumn="0" w:lastRowLastColumn="0"/>
+            <w:tcW w:w="2025" w:type="pct"/>
           </w:tcPr>
           <w:p>
             <w:pPr>
@@ -4105,7 +4113,7 @@
         </w:rPr>
         <w:t>State the basis for the overall outcome, including any conditions or follow-up actions required before the review can be considered approved:</w:t>
       </w:r>
-      <w:bookmarkEnd w:id="0"/>
+      <w:bookmarkEnd w:id="1"/>
       <w:bookmarkEnd w:id="17"/>
       <w:bookmarkEnd w:id="19"/>
     </w:p>
@@ -4297,6 +4305,19 @@
     </w:pPr>
     <w:r>
       <w:tab/>
+    </w:r>
+    <w:r>
+      <w:t>[Project Name]</w:t>
+    </w:r>
+  </w:p>
+  <w:p>
+    <w:pPr>
+      <w:pStyle w:val="Header"/>
+    </w:pPr>
+    <w:r>
+      <w:tab/>
+    </w:r>
+    <w:r>
       <w:t>[Review Title]</w:t>
     </w:r>
   </w:p>

</xml_diff>

<commit_message>
Add DocuSeal fields to assist with document signing when the DOCX file is uploaded.
</commit_message>
<xml_diff>
--- a/docs/review-template/review-template.docx
+++ b/docs/review-template/review-template.docx
@@ -617,26 +617,112 @@
               <w:rPr>
                 <w:i/>
                 <w:iCs/>
-              </w:rPr>
-              <w:t>[Signature]</w:t>
-            </w:r>
-          </w:p>
-        </w:tc>
-        <w:tc>
-          <w:tcPr>
-            <w:cnfStyle w:val="000010000000" w:firstRow="0" w:lastRow="0" w:firstColumn="0" w:lastColumn="0" w:oddVBand="1" w:evenVBand="0" w:oddHBand="0" w:evenHBand="0" w:firstRowFirstColumn="0" w:firstRowLastColumn="0" w:lastRowFirstColumn="0" w:lastRowLastColumn="0"/>
-            <w:tcW w:w="902" w:type="pct"/>
-          </w:tcPr>
-          <w:p>
-            <w:pPr>
-              <w:pStyle w:val="Compact"/>
-            </w:pPr>
+                <w:sz w:val="14"/>
+                <w:szCs w:val="20"/>
+              </w:rPr>
+              <w:t>{{</w:t>
+            </w:r>
+            <w:proofErr w:type="spellStart"/>
+            <w:proofErr w:type="gramStart"/>
             <w:r>
               <w:rPr>
                 <w:i/>
                 <w:iCs/>
-              </w:rPr>
-              <w:t>[YYYY-MM-DD]</w:t>
+                <w:sz w:val="14"/>
+                <w:szCs w:val="20"/>
+              </w:rPr>
+              <w:t>Signature;type</w:t>
+            </w:r>
+            <w:proofErr w:type="spellEnd"/>
+            <w:proofErr w:type="gramEnd"/>
+            <w:r>
+              <w:rPr>
+                <w:i/>
+                <w:iCs/>
+                <w:sz w:val="14"/>
+                <w:szCs w:val="20"/>
+              </w:rPr>
+              <w:t>=signature</w:t>
+            </w:r>
+            <w:r>
+              <w:rPr>
+                <w:i/>
+                <w:iCs/>
+                <w:sz w:val="14"/>
+                <w:szCs w:val="20"/>
+              </w:rPr>
+              <w:t>}}</w:t>
+            </w:r>
+          </w:p>
+        </w:tc>
+        <w:tc>
+          <w:tcPr>
+            <w:cnfStyle w:val="000010000000" w:firstRow="0" w:lastRow="0" w:firstColumn="0" w:lastColumn="0" w:oddVBand="1" w:evenVBand="0" w:oddHBand="0" w:evenHBand="0" w:firstRowFirstColumn="0" w:firstRowLastColumn="0" w:lastRowFirstColumn="0" w:lastRowLastColumn="0"/>
+            <w:tcW w:w="902" w:type="pct"/>
+          </w:tcPr>
+          <w:p>
+            <w:pPr>
+              <w:pStyle w:val="Compact"/>
+            </w:pPr>
+            <w:r>
+              <w:rPr>
+                <w:i/>
+                <w:iCs/>
+                <w:sz w:val="14"/>
+                <w:szCs w:val="20"/>
+              </w:rPr>
+              <w:t>{{</w:t>
+            </w:r>
+            <w:proofErr w:type="spellStart"/>
+            <w:proofErr w:type="gramStart"/>
+            <w:r>
+              <w:rPr>
+                <w:i/>
+                <w:iCs/>
+                <w:sz w:val="14"/>
+                <w:szCs w:val="20"/>
+              </w:rPr>
+              <w:t>Date;type</w:t>
+            </w:r>
+            <w:proofErr w:type="spellEnd"/>
+            <w:proofErr w:type="gramEnd"/>
+            <w:r>
+              <w:rPr>
+                <w:i/>
+                <w:iCs/>
+                <w:sz w:val="14"/>
+                <w:szCs w:val="20"/>
+              </w:rPr>
+              <w:t>=</w:t>
+            </w:r>
+            <w:proofErr w:type="spellStart"/>
+            <w:r>
+              <w:rPr>
+                <w:i/>
+                <w:iCs/>
+                <w:sz w:val="14"/>
+                <w:szCs w:val="20"/>
+              </w:rPr>
+              <w:t>dat</w:t>
+            </w:r>
+            <w:r>
+              <w:rPr>
+                <w:i/>
+                <w:iCs/>
+                <w:sz w:val="14"/>
+                <w:szCs w:val="20"/>
+              </w:rPr>
+              <w:t>enow</w:t>
+            </w:r>
+            <w:proofErr w:type="spellEnd"/>
+            <w:r>
+              <w:rPr>
+                <w:i/>
+                <w:iCs/>
+                <w:sz w:val="14"/>
+                <w:szCs w:val="20"/>
+              </w:rPr>
+              <w:t>}}</w:t>
             </w:r>
           </w:p>
         </w:tc>
@@ -799,7 +885,7 @@
     <w:p>
       <w:r>
         <w:pict w14:anchorId="15DB9D33">
-          <v:rect id="_x0000_i1025" style="width:0;height:1.5pt" o:hralign="center" o:hrstd="t" o:hr="t"/>
+          <v:rect id="_x0000_i1049" style="width:0;height:1.5pt" o:hralign="center" o:hrstd="t" o:hr="t"/>
         </w:pict>
       </w:r>
     </w:p>
@@ -3923,7 +4009,7 @@
     <w:p>
       <w:r>
         <w:pict w14:anchorId="252A5A7C">
-          <v:rect id="_x0000_i1026" style="width:0;height:1.5pt" o:hralign="center" o:hrstd="t" o:hr="t"/>
+          <v:rect id="_x0000_i1050" style="width:0;height:1.5pt" o:hralign="center" o:hrstd="t" o:hr="t"/>
         </w:pict>
       </w:r>
     </w:p>
@@ -4877,7 +4963,6 @@
   <w:style w:type="character" w:default="1" w:styleId="DefaultParagraphFont">
     <w:name w:val="Default Paragraph Font"/>
     <w:uiPriority w:val="1"/>
-    <w:semiHidden/>
     <w:unhideWhenUsed/>
   </w:style>
   <w:style w:type="table" w:default="1" w:styleId="TableNormal">

</xml_diff>

<commit_message>
Add DocuSeal fields to assist with document signing when the DOCX file is uploaded. (#8)
</commit_message>
<xml_diff>
--- a/docs/review-template/review-template.docx
+++ b/docs/review-template/review-template.docx
@@ -617,26 +617,112 @@
               <w:rPr>
                 <w:i/>
                 <w:iCs/>
-              </w:rPr>
-              <w:t>[Signature]</w:t>
-            </w:r>
-          </w:p>
-        </w:tc>
-        <w:tc>
-          <w:tcPr>
-            <w:cnfStyle w:val="000010000000" w:firstRow="0" w:lastRow="0" w:firstColumn="0" w:lastColumn="0" w:oddVBand="1" w:evenVBand="0" w:oddHBand="0" w:evenHBand="0" w:firstRowFirstColumn="0" w:firstRowLastColumn="0" w:lastRowFirstColumn="0" w:lastRowLastColumn="0"/>
-            <w:tcW w:w="902" w:type="pct"/>
-          </w:tcPr>
-          <w:p>
-            <w:pPr>
-              <w:pStyle w:val="Compact"/>
-            </w:pPr>
+                <w:sz w:val="14"/>
+                <w:szCs w:val="20"/>
+              </w:rPr>
+              <w:t>{{</w:t>
+            </w:r>
+            <w:proofErr w:type="spellStart"/>
+            <w:proofErr w:type="gramStart"/>
             <w:r>
               <w:rPr>
                 <w:i/>
                 <w:iCs/>
-              </w:rPr>
-              <w:t>[YYYY-MM-DD]</w:t>
+                <w:sz w:val="14"/>
+                <w:szCs w:val="20"/>
+              </w:rPr>
+              <w:t>Signature;type</w:t>
+            </w:r>
+            <w:proofErr w:type="spellEnd"/>
+            <w:proofErr w:type="gramEnd"/>
+            <w:r>
+              <w:rPr>
+                <w:i/>
+                <w:iCs/>
+                <w:sz w:val="14"/>
+                <w:szCs w:val="20"/>
+              </w:rPr>
+              <w:t>=signature</w:t>
+            </w:r>
+            <w:r>
+              <w:rPr>
+                <w:i/>
+                <w:iCs/>
+                <w:sz w:val="14"/>
+                <w:szCs w:val="20"/>
+              </w:rPr>
+              <w:t>}}</w:t>
+            </w:r>
+          </w:p>
+        </w:tc>
+        <w:tc>
+          <w:tcPr>
+            <w:cnfStyle w:val="000010000000" w:firstRow="0" w:lastRow="0" w:firstColumn="0" w:lastColumn="0" w:oddVBand="1" w:evenVBand="0" w:oddHBand="0" w:evenHBand="0" w:firstRowFirstColumn="0" w:firstRowLastColumn="0" w:lastRowFirstColumn="0" w:lastRowLastColumn="0"/>
+            <w:tcW w:w="902" w:type="pct"/>
+          </w:tcPr>
+          <w:p>
+            <w:pPr>
+              <w:pStyle w:val="Compact"/>
+            </w:pPr>
+            <w:r>
+              <w:rPr>
+                <w:i/>
+                <w:iCs/>
+                <w:sz w:val="14"/>
+                <w:szCs w:val="20"/>
+              </w:rPr>
+              <w:t>{{</w:t>
+            </w:r>
+            <w:proofErr w:type="spellStart"/>
+            <w:proofErr w:type="gramStart"/>
+            <w:r>
+              <w:rPr>
+                <w:i/>
+                <w:iCs/>
+                <w:sz w:val="14"/>
+                <w:szCs w:val="20"/>
+              </w:rPr>
+              <w:t>Date;type</w:t>
+            </w:r>
+            <w:proofErr w:type="spellEnd"/>
+            <w:proofErr w:type="gramEnd"/>
+            <w:r>
+              <w:rPr>
+                <w:i/>
+                <w:iCs/>
+                <w:sz w:val="14"/>
+                <w:szCs w:val="20"/>
+              </w:rPr>
+              <w:t>=</w:t>
+            </w:r>
+            <w:proofErr w:type="spellStart"/>
+            <w:r>
+              <w:rPr>
+                <w:i/>
+                <w:iCs/>
+                <w:sz w:val="14"/>
+                <w:szCs w:val="20"/>
+              </w:rPr>
+              <w:t>dat</w:t>
+            </w:r>
+            <w:r>
+              <w:rPr>
+                <w:i/>
+                <w:iCs/>
+                <w:sz w:val="14"/>
+                <w:szCs w:val="20"/>
+              </w:rPr>
+              <w:t>enow</w:t>
+            </w:r>
+            <w:proofErr w:type="spellEnd"/>
+            <w:r>
+              <w:rPr>
+                <w:i/>
+                <w:iCs/>
+                <w:sz w:val="14"/>
+                <w:szCs w:val="20"/>
+              </w:rPr>
+              <w:t>}}</w:t>
             </w:r>
           </w:p>
         </w:tc>
@@ -799,7 +885,7 @@
     <w:p>
       <w:r>
         <w:pict w14:anchorId="15DB9D33">
-          <v:rect id="_x0000_i1025" style="width:0;height:1.5pt" o:hralign="center" o:hrstd="t" o:hr="t"/>
+          <v:rect id="_x0000_i1049" style="width:0;height:1.5pt" o:hralign="center" o:hrstd="t" o:hr="t"/>
         </w:pict>
       </w:r>
     </w:p>
@@ -3923,7 +4009,7 @@
     <w:p>
       <w:r>
         <w:pict w14:anchorId="252A5A7C">
-          <v:rect id="_x0000_i1026" style="width:0;height:1.5pt" o:hralign="center" o:hrstd="t" o:hr="t"/>
+          <v:rect id="_x0000_i1050" style="width:0;height:1.5pt" o:hralign="center" o:hrstd="t" o:hr="t"/>
         </w:pict>
       </w:r>
     </w:p>
@@ -4877,7 +4963,6 @@
   <w:style w:type="character" w:default="1" w:styleId="DefaultParagraphFont">
     <w:name w:val="Default Paragraph Font"/>
     <w:uiPriority w:val="1"/>
-    <w:semiHidden/>
     <w:unhideWhenUsed/>
   </w:style>
   <w:style w:type="table" w:default="1" w:styleId="TableNormal">

</xml_diff>

<commit_message>
Update signature table row height to support DocuSeal signature blocks with extended information.
</commit_message>
<xml_diff>
--- a/docs/review-template/review-template.docx
+++ b/docs/review-template/review-template.docx
@@ -549,6 +549,8 @@
       <w:tr>
         <w:trPr>
           <w:cnfStyle w:val="000000100000" w:firstRow="0" w:lastRow="0" w:firstColumn="0" w:lastColumn="0" w:oddVBand="0" w:evenVBand="0" w:oddHBand="1" w:evenHBand="0" w:firstRowFirstColumn="0" w:firstRowLastColumn="0" w:lastRowFirstColumn="0" w:lastRowLastColumn="0"/>
+          <w:cantSplit/>
+          <w:trHeight w:val="1296"/>
         </w:trPr>
         <w:tc>
           <w:tcPr>
@@ -642,8 +644,19 @@
                 <w:sz w:val="14"/>
                 <w:szCs w:val="20"/>
               </w:rPr>
-              <w:t>=signature</w:t>
-            </w:r>
+              <w:t>=signature}}</w:t>
+            </w:r>
+          </w:p>
+        </w:tc>
+        <w:tc>
+          <w:tcPr>
+            <w:cnfStyle w:val="000010000000" w:firstRow="0" w:lastRow="0" w:firstColumn="0" w:lastColumn="0" w:oddVBand="1" w:evenVBand="0" w:oddHBand="0" w:evenHBand="0" w:firstRowFirstColumn="0" w:firstRowLastColumn="0" w:lastRowFirstColumn="0" w:lastRowLastColumn="0"/>
+            <w:tcW w:w="902" w:type="pct"/>
+          </w:tcPr>
+          <w:p>
+            <w:pPr>
+              <w:pStyle w:val="Compact"/>
+            </w:pPr>
             <w:r>
               <w:rPr>
                 <w:i/>
@@ -651,19 +664,10 @@
                 <w:sz w:val="14"/>
                 <w:szCs w:val="20"/>
               </w:rPr>
-              <w:t>}}</w:t>
-            </w:r>
-          </w:p>
-        </w:tc>
-        <w:tc>
-          <w:tcPr>
-            <w:cnfStyle w:val="000010000000" w:firstRow="0" w:lastRow="0" w:firstColumn="0" w:lastColumn="0" w:oddVBand="1" w:evenVBand="0" w:oddHBand="0" w:evenHBand="0" w:firstRowFirstColumn="0" w:firstRowLastColumn="0" w:lastRowFirstColumn="0" w:lastRowLastColumn="0"/>
-            <w:tcW w:w="902" w:type="pct"/>
-          </w:tcPr>
-          <w:p>
-            <w:pPr>
-              <w:pStyle w:val="Compact"/>
-            </w:pPr>
+              <w:t>{{</w:t>
+            </w:r>
+            <w:proofErr w:type="spellStart"/>
+            <w:proofErr w:type="gramStart"/>
             <w:r>
               <w:rPr>
                 <w:i/>
@@ -671,10 +675,10 @@
                 <w:sz w:val="14"/>
                 <w:szCs w:val="20"/>
               </w:rPr>
-              <w:t>{{</w:t>
-            </w:r>
-            <w:proofErr w:type="spellStart"/>
-            <w:proofErr w:type="gramStart"/>
+              <w:t>Date;type</w:t>
+            </w:r>
+            <w:proofErr w:type="spellEnd"/>
+            <w:proofErr w:type="gramEnd"/>
             <w:r>
               <w:rPr>
                 <w:i/>
@@ -682,10 +686,9 @@
                 <w:sz w:val="14"/>
                 <w:szCs w:val="20"/>
               </w:rPr>
-              <w:t>Date;type</w:t>
-            </w:r>
-            <w:proofErr w:type="spellEnd"/>
-            <w:proofErr w:type="gramEnd"/>
+              <w:t>=</w:t>
+            </w:r>
+            <w:proofErr w:type="spellStart"/>
             <w:r>
               <w:rPr>
                 <w:i/>
@@ -693,9 +696,8 @@
                 <w:sz w:val="14"/>
                 <w:szCs w:val="20"/>
               </w:rPr>
-              <w:t>=</w:t>
-            </w:r>
-            <w:proofErr w:type="spellStart"/>
+              <w:t>dat</w:t>
+            </w:r>
             <w:r>
               <w:rPr>
                 <w:i/>
@@ -703,8 +705,9 @@
                 <w:sz w:val="14"/>
                 <w:szCs w:val="20"/>
               </w:rPr>
-              <w:t>dat</w:t>
-            </w:r>
+              <w:t>enow</w:t>
+            </w:r>
+            <w:proofErr w:type="spellEnd"/>
             <w:r>
               <w:rPr>
                 <w:i/>
@@ -712,109 +715,7 @@
                 <w:sz w:val="14"/>
                 <w:szCs w:val="20"/>
               </w:rPr>
-              <w:t>enow</w:t>
-            </w:r>
-            <w:proofErr w:type="spellEnd"/>
-            <w:r>
-              <w:rPr>
-                <w:i/>
-                <w:iCs/>
-                <w:sz w:val="14"/>
-                <w:szCs w:val="20"/>
-              </w:rPr>
               <w:t>}}</w:t>
-            </w:r>
-          </w:p>
-        </w:tc>
-      </w:tr>
-      <w:tr>
-        <w:tc>
-          <w:tcPr>
-            <w:cnfStyle w:val="000010000000" w:firstRow="0" w:lastRow="0" w:firstColumn="0" w:lastColumn="0" w:oddVBand="1" w:evenVBand="0" w:oddHBand="0" w:evenHBand="0" w:firstRowFirstColumn="0" w:firstRowLastColumn="0" w:lastRowFirstColumn="0" w:lastRowLastColumn="0"/>
-            <w:tcW w:w="1056" w:type="pct"/>
-          </w:tcPr>
-          <w:p>
-            <w:pPr>
-              <w:pStyle w:val="Compact"/>
-            </w:pPr>
-            <w:r>
-              <w:rPr>
-                <w:i/>
-                <w:iCs/>
-              </w:rPr>
-              <w:t>[Reviewer name]</w:t>
-            </w:r>
-          </w:p>
-        </w:tc>
-        <w:tc>
-          <w:tcPr>
-            <w:tcW w:w="713" w:type="pct"/>
-          </w:tcPr>
-          <w:p>
-            <w:pPr>
-              <w:pStyle w:val="Compact"/>
-              <w:cnfStyle w:val="000000000000" w:firstRow="0" w:lastRow="0" w:firstColumn="0" w:lastColumn="0" w:oddVBand="0" w:evenVBand="0" w:oddHBand="0" w:evenHBand="0" w:firstRowFirstColumn="0" w:firstRowLastColumn="0" w:lastRowFirstColumn="0" w:lastRowLastColumn="0"/>
-            </w:pPr>
-            <w:r>
-              <w:rPr>
-                <w:i/>
-                <w:iCs/>
-              </w:rPr>
-              <w:t>[Role]</w:t>
-            </w:r>
-          </w:p>
-        </w:tc>
-        <w:tc>
-          <w:tcPr>
-            <w:cnfStyle w:val="000010000000" w:firstRow="0" w:lastRow="0" w:firstColumn="0" w:lastColumn="0" w:oddVBand="1" w:evenVBand="0" w:oddHBand="0" w:evenHBand="0" w:firstRowFirstColumn="0" w:firstRowLastColumn="0" w:lastRowFirstColumn="0" w:lastRowLastColumn="0"/>
-            <w:tcW w:w="1295" w:type="pct"/>
-          </w:tcPr>
-          <w:p>
-            <w:pPr>
-              <w:pStyle w:val="Compact"/>
-            </w:pPr>
-            <w:r>
-              <w:rPr>
-                <w:i/>
-                <w:iCs/>
-              </w:rPr>
-              <w:t>[Organization]</w:t>
-            </w:r>
-          </w:p>
-        </w:tc>
-        <w:tc>
-          <w:tcPr>
-            <w:tcW w:w="1034" w:type="pct"/>
-          </w:tcPr>
-          <w:p>
-            <w:pPr>
-              <w:pStyle w:val="Compact"/>
-              <w:cnfStyle w:val="000000000000" w:firstRow="0" w:lastRow="0" w:firstColumn="0" w:lastColumn="0" w:oddVBand="0" w:evenVBand="0" w:oddHBand="0" w:evenHBand="0" w:firstRowFirstColumn="0" w:firstRowLastColumn="0" w:lastRowFirstColumn="0" w:lastRowLastColumn="0"/>
-            </w:pPr>
-            <w:r>
-              <w:rPr>
-                <w:i/>
-                <w:iCs/>
-              </w:rPr>
-              <w:t>[Signature]</w:t>
-            </w:r>
-          </w:p>
-        </w:tc>
-        <w:tc>
-          <w:tcPr>
-            <w:cnfStyle w:val="000010000000" w:firstRow="0" w:lastRow="0" w:firstColumn="0" w:lastColumn="0" w:oddVBand="1" w:evenVBand="0" w:oddHBand="0" w:evenHBand="0" w:firstRowFirstColumn="0" w:firstRowLastColumn="0" w:lastRowFirstColumn="0" w:lastRowLastColumn="0"/>
-            <w:tcW w:w="902" w:type="pct"/>
-          </w:tcPr>
-          <w:p>
-            <w:pPr>
-              <w:pStyle w:val="Compact"/>
-            </w:pPr>
-            <w:r>
-              <w:rPr>
-                <w:i/>
-                <w:iCs/>
-              </w:rPr>
-              <w:t>[YYYY-MM-DD]</w:t>
             </w:r>
           </w:p>
         </w:tc>
@@ -885,7 +786,7 @@
     <w:p>
       <w:r>
         <w:pict w14:anchorId="15DB9D33">
-          <v:rect id="_x0000_i1049" style="width:0;height:1.5pt" o:hralign="center" o:hrstd="t" o:hr="t"/>
+          <v:rect id="_x0000_i1025" style="width:0;height:1.5pt" o:hralign="center" o:hrstd="t" o:hr="t"/>
         </w:pict>
       </w:r>
     </w:p>
@@ -977,6 +878,7 @@
               <w:rPr>
                 <w:szCs w:val="18"/>
               </w:rPr>
+              <w:lastRenderedPageBreak/>
               <w:t>#</w:t>
             </w:r>
           </w:p>
@@ -1150,7 +1052,6 @@
                 <w:sz w:val="12"/>
                 <w:szCs w:val="12"/>
               </w:rPr>
-              <w:lastRenderedPageBreak/>
               <w:t>REQ-02</w:t>
             </w:r>
           </w:p>
@@ -2569,6 +2470,7 @@
           <w:i/>
           <w:iCs/>
         </w:rPr>
+        <w:lastRenderedPageBreak/>
         <w:t>Skip this section if the review contains no test code files. If not applicable, record the reason here:</w:t>
       </w:r>
     </w:p>
@@ -2599,7 +2501,6 @@
               <w:pStyle w:val="Compact"/>
             </w:pPr>
             <w:r>
-              <w:lastRenderedPageBreak/>
               <w:t>#</w:t>
             </w:r>
           </w:p>
@@ -3814,6 +3715,7 @@
               <w:pStyle w:val="Compact"/>
             </w:pPr>
             <w:r>
+              <w:lastRenderedPageBreak/>
               <w:t>#</w:t>
             </w:r>
           </w:p>
@@ -3883,7 +3785,6 @@
                 <w:sz w:val="12"/>
                 <w:szCs w:val="12"/>
               </w:rPr>
-              <w:lastRenderedPageBreak/>
               <w:t>CODEDOC-01</w:t>
             </w:r>
           </w:p>
@@ -4009,7 +3910,7 @@
     <w:p>
       <w:r>
         <w:pict w14:anchorId="252A5A7C">
-          <v:rect id="_x0000_i1050" style="width:0;height:1.5pt" o:hralign="center" o:hrstd="t" o:hr="t"/>
+          <v:rect id="_x0000_i1026" style="width:0;height:1.5pt" o:hralign="center" o:hrstd="t" o:hr="t"/>
         </w:pict>
       </w:r>
     </w:p>
@@ -4963,6 +4864,7 @@
   <w:style w:type="character" w:default="1" w:styleId="DefaultParagraphFont">
     <w:name w:val="Default Paragraph Font"/>
     <w:uiPriority w:val="1"/>
+    <w:semiHidden/>
     <w:unhideWhenUsed/>
   </w:style>
   <w:style w:type="table" w:default="1" w:styleId="TableNormal">

</xml_diff>

<commit_message>
Update signature table row height to support DocuSeal signature blocks with extended information. (#9)
</commit_message>
<xml_diff>
--- a/docs/review-template/review-template.docx
+++ b/docs/review-template/review-template.docx
@@ -549,6 +549,8 @@
       <w:tr>
         <w:trPr>
           <w:cnfStyle w:val="000000100000" w:firstRow="0" w:lastRow="0" w:firstColumn="0" w:lastColumn="0" w:oddVBand="0" w:evenVBand="0" w:oddHBand="1" w:evenHBand="0" w:firstRowFirstColumn="0" w:firstRowLastColumn="0" w:lastRowFirstColumn="0" w:lastRowLastColumn="0"/>
+          <w:cantSplit/>
+          <w:trHeight w:val="1296"/>
         </w:trPr>
         <w:tc>
           <w:tcPr>
@@ -642,8 +644,19 @@
                 <w:sz w:val="14"/>
                 <w:szCs w:val="20"/>
               </w:rPr>
-              <w:t>=signature</w:t>
-            </w:r>
+              <w:t>=signature}}</w:t>
+            </w:r>
+          </w:p>
+        </w:tc>
+        <w:tc>
+          <w:tcPr>
+            <w:cnfStyle w:val="000010000000" w:firstRow="0" w:lastRow="0" w:firstColumn="0" w:lastColumn="0" w:oddVBand="1" w:evenVBand="0" w:oddHBand="0" w:evenHBand="0" w:firstRowFirstColumn="0" w:firstRowLastColumn="0" w:lastRowFirstColumn="0" w:lastRowLastColumn="0"/>
+            <w:tcW w:w="902" w:type="pct"/>
+          </w:tcPr>
+          <w:p>
+            <w:pPr>
+              <w:pStyle w:val="Compact"/>
+            </w:pPr>
             <w:r>
               <w:rPr>
                 <w:i/>
@@ -651,19 +664,10 @@
                 <w:sz w:val="14"/>
                 <w:szCs w:val="20"/>
               </w:rPr>
-              <w:t>}}</w:t>
-            </w:r>
-          </w:p>
-        </w:tc>
-        <w:tc>
-          <w:tcPr>
-            <w:cnfStyle w:val="000010000000" w:firstRow="0" w:lastRow="0" w:firstColumn="0" w:lastColumn="0" w:oddVBand="1" w:evenVBand="0" w:oddHBand="0" w:evenHBand="0" w:firstRowFirstColumn="0" w:firstRowLastColumn="0" w:lastRowFirstColumn="0" w:lastRowLastColumn="0"/>
-            <w:tcW w:w="902" w:type="pct"/>
-          </w:tcPr>
-          <w:p>
-            <w:pPr>
-              <w:pStyle w:val="Compact"/>
-            </w:pPr>
+              <w:t>{{</w:t>
+            </w:r>
+            <w:proofErr w:type="spellStart"/>
+            <w:proofErr w:type="gramStart"/>
             <w:r>
               <w:rPr>
                 <w:i/>
@@ -671,10 +675,10 @@
                 <w:sz w:val="14"/>
                 <w:szCs w:val="20"/>
               </w:rPr>
-              <w:t>{{</w:t>
-            </w:r>
-            <w:proofErr w:type="spellStart"/>
-            <w:proofErr w:type="gramStart"/>
+              <w:t>Date;type</w:t>
+            </w:r>
+            <w:proofErr w:type="spellEnd"/>
+            <w:proofErr w:type="gramEnd"/>
             <w:r>
               <w:rPr>
                 <w:i/>
@@ -682,10 +686,9 @@
                 <w:sz w:val="14"/>
                 <w:szCs w:val="20"/>
               </w:rPr>
-              <w:t>Date;type</w:t>
-            </w:r>
-            <w:proofErr w:type="spellEnd"/>
-            <w:proofErr w:type="gramEnd"/>
+              <w:t>=</w:t>
+            </w:r>
+            <w:proofErr w:type="spellStart"/>
             <w:r>
               <w:rPr>
                 <w:i/>
@@ -693,9 +696,8 @@
                 <w:sz w:val="14"/>
                 <w:szCs w:val="20"/>
               </w:rPr>
-              <w:t>=</w:t>
-            </w:r>
-            <w:proofErr w:type="spellStart"/>
+              <w:t>dat</w:t>
+            </w:r>
             <w:r>
               <w:rPr>
                 <w:i/>
@@ -703,8 +705,9 @@
                 <w:sz w:val="14"/>
                 <w:szCs w:val="20"/>
               </w:rPr>
-              <w:t>dat</w:t>
-            </w:r>
+              <w:t>enow</w:t>
+            </w:r>
+            <w:proofErr w:type="spellEnd"/>
             <w:r>
               <w:rPr>
                 <w:i/>
@@ -712,109 +715,7 @@
                 <w:sz w:val="14"/>
                 <w:szCs w:val="20"/>
               </w:rPr>
-              <w:t>enow</w:t>
-            </w:r>
-            <w:proofErr w:type="spellEnd"/>
-            <w:r>
-              <w:rPr>
-                <w:i/>
-                <w:iCs/>
-                <w:sz w:val="14"/>
-                <w:szCs w:val="20"/>
-              </w:rPr>
               <w:t>}}</w:t>
-            </w:r>
-          </w:p>
-        </w:tc>
-      </w:tr>
-      <w:tr>
-        <w:tc>
-          <w:tcPr>
-            <w:cnfStyle w:val="000010000000" w:firstRow="0" w:lastRow="0" w:firstColumn="0" w:lastColumn="0" w:oddVBand="1" w:evenVBand="0" w:oddHBand="0" w:evenHBand="0" w:firstRowFirstColumn="0" w:firstRowLastColumn="0" w:lastRowFirstColumn="0" w:lastRowLastColumn="0"/>
-            <w:tcW w:w="1056" w:type="pct"/>
-          </w:tcPr>
-          <w:p>
-            <w:pPr>
-              <w:pStyle w:val="Compact"/>
-            </w:pPr>
-            <w:r>
-              <w:rPr>
-                <w:i/>
-                <w:iCs/>
-              </w:rPr>
-              <w:t>[Reviewer name]</w:t>
-            </w:r>
-          </w:p>
-        </w:tc>
-        <w:tc>
-          <w:tcPr>
-            <w:tcW w:w="713" w:type="pct"/>
-          </w:tcPr>
-          <w:p>
-            <w:pPr>
-              <w:pStyle w:val="Compact"/>
-              <w:cnfStyle w:val="000000000000" w:firstRow="0" w:lastRow="0" w:firstColumn="0" w:lastColumn="0" w:oddVBand="0" w:evenVBand="0" w:oddHBand="0" w:evenHBand="0" w:firstRowFirstColumn="0" w:firstRowLastColumn="0" w:lastRowFirstColumn="0" w:lastRowLastColumn="0"/>
-            </w:pPr>
-            <w:r>
-              <w:rPr>
-                <w:i/>
-                <w:iCs/>
-              </w:rPr>
-              <w:t>[Role]</w:t>
-            </w:r>
-          </w:p>
-        </w:tc>
-        <w:tc>
-          <w:tcPr>
-            <w:cnfStyle w:val="000010000000" w:firstRow="0" w:lastRow="0" w:firstColumn="0" w:lastColumn="0" w:oddVBand="1" w:evenVBand="0" w:oddHBand="0" w:evenHBand="0" w:firstRowFirstColumn="0" w:firstRowLastColumn="0" w:lastRowFirstColumn="0" w:lastRowLastColumn="0"/>
-            <w:tcW w:w="1295" w:type="pct"/>
-          </w:tcPr>
-          <w:p>
-            <w:pPr>
-              <w:pStyle w:val="Compact"/>
-            </w:pPr>
-            <w:r>
-              <w:rPr>
-                <w:i/>
-                <w:iCs/>
-              </w:rPr>
-              <w:t>[Organization]</w:t>
-            </w:r>
-          </w:p>
-        </w:tc>
-        <w:tc>
-          <w:tcPr>
-            <w:tcW w:w="1034" w:type="pct"/>
-          </w:tcPr>
-          <w:p>
-            <w:pPr>
-              <w:pStyle w:val="Compact"/>
-              <w:cnfStyle w:val="000000000000" w:firstRow="0" w:lastRow="0" w:firstColumn="0" w:lastColumn="0" w:oddVBand="0" w:evenVBand="0" w:oddHBand="0" w:evenHBand="0" w:firstRowFirstColumn="0" w:firstRowLastColumn="0" w:lastRowFirstColumn="0" w:lastRowLastColumn="0"/>
-            </w:pPr>
-            <w:r>
-              <w:rPr>
-                <w:i/>
-                <w:iCs/>
-              </w:rPr>
-              <w:t>[Signature]</w:t>
-            </w:r>
-          </w:p>
-        </w:tc>
-        <w:tc>
-          <w:tcPr>
-            <w:cnfStyle w:val="000010000000" w:firstRow="0" w:lastRow="0" w:firstColumn="0" w:lastColumn="0" w:oddVBand="1" w:evenVBand="0" w:oddHBand="0" w:evenHBand="0" w:firstRowFirstColumn="0" w:firstRowLastColumn="0" w:lastRowFirstColumn="0" w:lastRowLastColumn="0"/>
-            <w:tcW w:w="902" w:type="pct"/>
-          </w:tcPr>
-          <w:p>
-            <w:pPr>
-              <w:pStyle w:val="Compact"/>
-            </w:pPr>
-            <w:r>
-              <w:rPr>
-                <w:i/>
-                <w:iCs/>
-              </w:rPr>
-              <w:t>[YYYY-MM-DD]</w:t>
             </w:r>
           </w:p>
         </w:tc>
@@ -885,7 +786,7 @@
     <w:p>
       <w:r>
         <w:pict w14:anchorId="15DB9D33">
-          <v:rect id="_x0000_i1049" style="width:0;height:1.5pt" o:hralign="center" o:hrstd="t" o:hr="t"/>
+          <v:rect id="_x0000_i1025" style="width:0;height:1.5pt" o:hralign="center" o:hrstd="t" o:hr="t"/>
         </w:pict>
       </w:r>
     </w:p>
@@ -977,6 +878,7 @@
               <w:rPr>
                 <w:szCs w:val="18"/>
               </w:rPr>
+              <w:lastRenderedPageBreak/>
               <w:t>#</w:t>
             </w:r>
           </w:p>
@@ -1150,7 +1052,6 @@
                 <w:sz w:val="12"/>
                 <w:szCs w:val="12"/>
               </w:rPr>
-              <w:lastRenderedPageBreak/>
               <w:t>REQ-02</w:t>
             </w:r>
           </w:p>
@@ -2569,6 +2470,7 @@
           <w:i/>
           <w:iCs/>
         </w:rPr>
+        <w:lastRenderedPageBreak/>
         <w:t>Skip this section if the review contains no test code files. If not applicable, record the reason here:</w:t>
       </w:r>
     </w:p>
@@ -2599,7 +2501,6 @@
               <w:pStyle w:val="Compact"/>
             </w:pPr>
             <w:r>
-              <w:lastRenderedPageBreak/>
               <w:t>#</w:t>
             </w:r>
           </w:p>
@@ -3814,6 +3715,7 @@
               <w:pStyle w:val="Compact"/>
             </w:pPr>
             <w:r>
+              <w:lastRenderedPageBreak/>
               <w:t>#</w:t>
             </w:r>
           </w:p>
@@ -3883,7 +3785,6 @@
                 <w:sz w:val="12"/>
                 <w:szCs w:val="12"/>
               </w:rPr>
-              <w:lastRenderedPageBreak/>
               <w:t>CODEDOC-01</w:t>
             </w:r>
           </w:p>
@@ -4009,7 +3910,7 @@
     <w:p>
       <w:r>
         <w:pict w14:anchorId="252A5A7C">
-          <v:rect id="_x0000_i1050" style="width:0;height:1.5pt" o:hralign="center" o:hrstd="t" o:hr="t"/>
+          <v:rect id="_x0000_i1026" style="width:0;height:1.5pt" o:hralign="center" o:hrstd="t" o:hr="t"/>
         </w:pict>
       </w:r>
     </w:p>
@@ -4963,6 +4864,7 @@
   <w:style w:type="character" w:default="1" w:styleId="DefaultParagraphFont">
     <w:name w:val="Default Paragraph Font"/>
     <w:uiPriority w:val="1"/>
+    <w:semiHidden/>
     <w:unhideWhenUsed/>
   </w:style>
   <w:style w:type="table" w:default="1" w:styleId="TableNormal">

</xml_diff>